<commit_message>
Merge: D5 to main
</commit_message>
<xml_diff>
--- a/docs/provided-docs/Weekly meeting template.docx
+++ b/docs/provided-docs/Weekly meeting template.docx
@@ -212,7 +212,13 @@
           </w:tcPr>
           <w:p>
             <w:r>
-              <w:t>Student 1</w:t>
+              <w:t>Mah</w:t>
+            </w:r>
+            <w:r>
+              <w:t xml:space="preserve"> </w:t>
+            </w:r>
+            <w:r>
+              <w:t>Han Cheng</w:t>
             </w:r>
           </w:p>
         </w:tc>
@@ -222,7 +228,14 @@
             <w:shd w:val="clear" w:color="auto" w:fill="DAEEF3" w:themeFill="accent5" w:themeFillTint="33"/>
             <w:vAlign w:val="center"/>
           </w:tcPr>
-          <w:p/>
+          <w:p>
+            <w:pPr>
+              <w:jc w:val="center"/>
+            </w:pPr>
+            <w:r>
+              <w:t>Yes</w:t>
+            </w:r>
+          </w:p>
         </w:tc>
         <w:tc>
           <w:tcPr>
@@ -252,7 +265,13 @@
           </w:tcPr>
           <w:p>
             <w:r>
-              <w:t>Student 2</w:t>
+              <w:t>Abdul Hadi</w:t>
+            </w:r>
+            <w:r>
+              <w:t xml:space="preserve"> </w:t>
+            </w:r>
+            <w:r>
+              <w:t>Ghani</w:t>
             </w:r>
           </w:p>
         </w:tc>
@@ -262,7 +281,14 @@
             <w:shd w:val="clear" w:color="auto" w:fill="DAEEF3" w:themeFill="accent5" w:themeFillTint="33"/>
             <w:vAlign w:val="center"/>
           </w:tcPr>
-          <w:p/>
+          <w:p>
+            <w:pPr>
+              <w:jc w:val="center"/>
+            </w:pPr>
+            <w:r>
+              <w:t>Yes</w:t>
+            </w:r>
+          </w:p>
         </w:tc>
         <w:tc>
           <w:tcPr>
@@ -291,8 +317,22 @@
             <w:vAlign w:val="center"/>
           </w:tcPr>
           <w:p>
-            <w:r>
-              <w:t>Student 3</w:t>
+            <w:proofErr w:type="spellStart"/>
+            <w:r>
+              <w:t>Lushantha</w:t>
+            </w:r>
+            <w:proofErr w:type="spellEnd"/>
+            <w:r>
+              <w:t xml:space="preserve"> </w:t>
+            </w:r>
+            <w:r>
+              <w:t>Lee</w:t>
+            </w:r>
+            <w:r>
+              <w:t xml:space="preserve"> </w:t>
+            </w:r>
+            <w:r>
+              <w:t>Ning</w:t>
             </w:r>
           </w:p>
         </w:tc>
@@ -302,7 +342,14 @@
             <w:shd w:val="clear" w:color="auto" w:fill="DAEEF3" w:themeFill="accent5" w:themeFillTint="33"/>
             <w:vAlign w:val="center"/>
           </w:tcPr>
-          <w:p/>
+          <w:p>
+            <w:pPr>
+              <w:jc w:val="center"/>
+            </w:pPr>
+            <w:r>
+              <w:t>Yes</w:t>
+            </w:r>
+          </w:p>
         </w:tc>
         <w:tc>
           <w:tcPr>
@@ -332,7 +379,13 @@
           </w:tcPr>
           <w:p>
             <w:r>
-              <w:t>Student 4</w:t>
+              <w:t xml:space="preserve">Stanly </w:t>
+            </w:r>
+            <w:r>
+              <w:t xml:space="preserve">Teh </w:t>
+            </w:r>
+            <w:r>
+              <w:t>Whye Bin</w:t>
             </w:r>
           </w:p>
         </w:tc>
@@ -342,7 +395,14 @@
             <w:shd w:val="clear" w:color="auto" w:fill="DAEEF3" w:themeFill="accent5" w:themeFillTint="33"/>
             <w:vAlign w:val="center"/>
           </w:tcPr>
-          <w:p/>
+          <w:p>
+            <w:pPr>
+              <w:jc w:val="center"/>
+            </w:pPr>
+            <w:r>
+              <w:t>Yes</w:t>
+            </w:r>
+          </w:p>
         </w:tc>
         <w:tc>
           <w:tcPr>
@@ -385,6 +445,13 @@
                 <w:bCs/>
               </w:rPr>
               <w:t>:</w:t>
+            </w:r>
+            <w:r>
+              <w:rPr>
+                <w:b/>
+                <w:bCs/>
+              </w:rPr>
+              <w:t xml:space="preserve"> Dr. Najib</w:t>
             </w:r>
           </w:p>
         </w:tc>

</xml_diff>